<commit_message>
Pre clean up script
</commit_message>
<xml_diff>
--- a/Week_02/Day_09/Lab/Day_09_Lab_Guide.docx
+++ b/Week_02/Day_09/Lab/Day_09_Lab_Guide.docx
@@ -420,6 +420,7 @@
             <w:pPr>
               <w:pStyle w:val="Normal"/>
               <w:widowControl/>
+              <w:suppressAutoHyphens w:val="true"/>
               <w:spacing w:lineRule="auto" w:line="240" w:before="0" w:after="0"/>
               <w:jc w:val="start"/>
               <w:rPr>
@@ -460,6 +461,7 @@
             <w:pPr>
               <w:pStyle w:val="Normal"/>
               <w:widowControl/>
+              <w:suppressAutoHyphens w:val="true"/>
               <w:spacing w:lineRule="auto" w:line="240" w:before="0" w:after="0"/>
               <w:jc w:val="start"/>
               <w:rPr>
@@ -499,6 +501,7 @@
             <w:pPr>
               <w:pStyle w:val="Normal"/>
               <w:widowControl/>
+              <w:suppressAutoHyphens w:val="true"/>
               <w:spacing w:lineRule="auto" w:line="240" w:before="0" w:after="0"/>
               <w:jc w:val="start"/>
               <w:rPr>
@@ -537,6 +540,7 @@
             <w:pPr>
               <w:pStyle w:val="Normal"/>
               <w:widowControl/>
+              <w:suppressAutoHyphens w:val="true"/>
               <w:spacing w:lineRule="auto" w:line="240" w:before="0" w:after="0"/>
               <w:jc w:val="start"/>
               <w:rPr>
@@ -570,6 +574,7 @@
             <w:pPr>
               <w:pStyle w:val="Normal"/>
               <w:widowControl/>
+              <w:suppressAutoHyphens w:val="true"/>
               <w:spacing w:lineRule="auto" w:line="240" w:before="0" w:after="0"/>
               <w:jc w:val="start"/>
               <w:rPr>
@@ -599,6 +604,7 @@
             <w:pPr>
               <w:pStyle w:val="Normal"/>
               <w:widowControl/>
+              <w:suppressAutoHyphens w:val="true"/>
               <w:spacing w:lineRule="auto" w:line="240" w:before="0" w:after="0"/>
               <w:jc w:val="start"/>
               <w:rPr>
@@ -635,6 +641,7 @@
             <w:pPr>
               <w:pStyle w:val="Normal"/>
               <w:widowControl/>
+              <w:suppressAutoHyphens w:val="true"/>
               <w:spacing w:lineRule="auto" w:line="240" w:before="0" w:after="0"/>
               <w:jc w:val="start"/>
               <w:rPr>
@@ -673,6 +680,7 @@
             <w:pPr>
               <w:pStyle w:val="Normal"/>
               <w:widowControl/>
+              <w:suppressAutoHyphens w:val="true"/>
               <w:spacing w:lineRule="auto" w:line="240" w:before="0" w:after="0"/>
               <w:jc w:val="start"/>
               <w:rPr>
@@ -706,6 +714,7 @@
             <w:pPr>
               <w:pStyle w:val="Normal"/>
               <w:widowControl/>
+              <w:suppressAutoHyphens w:val="true"/>
               <w:spacing w:lineRule="auto" w:line="240" w:before="0" w:after="0"/>
               <w:jc w:val="start"/>
               <w:rPr>
@@ -738,6 +747,7 @@
             <w:pPr>
               <w:pStyle w:val="Normal"/>
               <w:widowControl/>
+              <w:suppressAutoHyphens w:val="true"/>
               <w:spacing w:lineRule="auto" w:line="240" w:before="0" w:after="0"/>
               <w:jc w:val="start"/>
               <w:rPr>
@@ -771,6 +781,7 @@
             <w:pPr>
               <w:pStyle w:val="Normal"/>
               <w:widowControl/>
+              <w:suppressAutoHyphens w:val="true"/>
               <w:spacing w:lineRule="auto" w:line="240" w:before="0" w:after="0"/>
               <w:jc w:val="start"/>
               <w:rPr>
@@ -800,6 +811,7 @@
             <w:pPr>
               <w:pStyle w:val="Normal"/>
               <w:widowControl/>
+              <w:suppressAutoHyphens w:val="true"/>
               <w:spacing w:lineRule="auto" w:line="240" w:before="0" w:after="0"/>
               <w:jc w:val="start"/>
               <w:rPr>
@@ -835,6 +847,7 @@
             <w:pPr>
               <w:pStyle w:val="Normal"/>
               <w:widowControl/>
+              <w:suppressAutoHyphens w:val="true"/>
               <w:spacing w:lineRule="auto" w:line="240" w:before="0" w:after="0"/>
               <w:jc w:val="start"/>
               <w:rPr>
@@ -872,6 +885,7 @@
             <w:pPr>
               <w:pStyle w:val="Normal"/>
               <w:widowControl/>
+              <w:suppressAutoHyphens w:val="true"/>
               <w:spacing w:lineRule="auto" w:line="240" w:before="0" w:after="0"/>
               <w:jc w:val="start"/>
               <w:rPr>
@@ -904,6 +918,7 @@
             <w:pPr>
               <w:pStyle w:val="Normal"/>
               <w:widowControl/>
+              <w:suppressAutoHyphens w:val="true"/>
               <w:spacing w:lineRule="auto" w:line="240" w:before="0" w:after="0"/>
               <w:jc w:val="start"/>
               <w:rPr>
@@ -2479,9 +2494,7 @@
                 <w:color w:val="141820"/>
                 <w:sz w:val="18"/>
               </w:rPr>
-              <w:t>docker exec kafka1 kafka-metadata-quorum \</w:t>
-              <w:br/>
-              <w:t xml:space="preserve">  --bootstrap-server kafka1:29092 describe --status</w:t>
+              <w:t>docker exec kafka1 kafka-metadata-quorum --bootstrap-server kafka1:29092 describe --status</w:t>
             </w:r>
           </w:p>
         </w:tc>
@@ -3554,7 +3567,23 @@
                 <w:color w:val="141820"/>
                 <w:sz w:val="18"/>
               </w:rPr>
-              <w:t>docker exec -it postgres psql -U taxi -d taxi -c \</w:t>
+              <w:t xml:space="preserve">docker exec -it postgres psql -U taxi -d taxi -c </w:t>
+            </w:r>
+            <w:r>
+              <w:rPr>
+                <w:rFonts w:ascii="Consolas" w:hAnsi="Consolas"/>
+                <w:color w:val="141820"/>
+                <w:sz w:val="18"/>
+                <w:lang w:val="en-IN"/>
+              </w:rPr>
+              <w:t>^</w:t>
+            </w:r>
+            <w:r>
+              <w:rPr>
+                <w:rFonts w:ascii="Consolas" w:hAnsi="Consolas"/>
+                <w:color w:val="141820"/>
+                <w:sz w:val="18"/>
+              </w:rPr>
               <w:br/>
               <w:t xml:space="preserve">  "SELECT driver_id, full_name, vehicle_make, rating FROM drivers LIMIT 5;"</w:t>
             </w:r>
@@ -3708,11 +3737,59 @@
                 <w:color w:val="141820"/>
                 <w:sz w:val="18"/>
               </w:rPr>
-              <w:t>docker exec kafka1 kafka-console-consumer \</w:t>
+              <w:t xml:space="preserve">docker exec kafka1 kafka-console-consumer </w:t>
+            </w:r>
+            <w:r>
+              <w:rPr>
+                <w:rFonts w:ascii="Consolas" w:hAnsi="Consolas"/>
+                <w:color w:val="141820"/>
+                <w:sz w:val="18"/>
+                <w:lang w:val="en-IN"/>
+              </w:rPr>
+              <w:t>^</w:t>
+            </w:r>
+            <w:r>
+              <w:rPr>
+                <w:rFonts w:ascii="Consolas" w:hAnsi="Consolas"/>
+                <w:color w:val="141820"/>
+                <w:sz w:val="18"/>
+              </w:rPr>
               <w:br/>
-              <w:t xml:space="preserve">  --bootstrap-server kafka1:29092 \</w:t>
+              <w:t xml:space="preserve">  --bootstrap-server kafka1:29092 </w:t>
+            </w:r>
+            <w:r>
+              <w:rPr>
+                <w:rFonts w:ascii="Consolas" w:hAnsi="Consolas"/>
+                <w:color w:val="141820"/>
+                <w:sz w:val="18"/>
+                <w:lang w:val="en-IN"/>
+              </w:rPr>
+              <w:t>^</w:t>
+            </w:r>
+            <w:r>
+              <w:rPr>
+                <w:rFonts w:ascii="Consolas" w:hAnsi="Consolas"/>
+                <w:color w:val="141820"/>
+                <w:sz w:val="18"/>
+              </w:rPr>
               <w:br/>
-              <w:t xml:space="preserve">  --topic cdc.public.drivers \</w:t>
+              <w:t xml:space="preserve">  --topic cdc.public.drivers </w:t>
+            </w:r>
+            <w:r>
+              <w:rPr>
+                <w:rFonts w:ascii="Consolas" w:hAnsi="Consolas"/>
+                <w:color w:val="141820"/>
+                <w:sz w:val="18"/>
+                <w:lang w:val="en-IN"/>
+              </w:rPr>
+              <w:t>^</w:t>
+            </w:r>
+            <w:r>
+              <w:rPr>
+                <w:rFonts w:ascii="Consolas" w:hAnsi="Consolas"/>
+                <w:color w:val="141820"/>
+                <w:sz w:val="18"/>
+              </w:rPr>
               <w:br/>
               <w:t xml:space="preserve">  --from-beginning --max-messages 3</w:t>
             </w:r>
@@ -3790,7 +3867,23 @@
                 <w:color w:val="141820"/>
                 <w:sz w:val="18"/>
               </w:rPr>
-              <w:t>docker exec -it postgres psql -U taxi -d taxi -c \</w:t>
+              <w:t xml:space="preserve">docker exec -it postgres psql -U taxi -d taxi -c </w:t>
+            </w:r>
+            <w:r>
+              <w:rPr>
+                <w:rFonts w:ascii="Consolas" w:hAnsi="Consolas"/>
+                <w:color w:val="141820"/>
+                <w:sz w:val="18"/>
+                <w:lang w:val="en-IN"/>
+              </w:rPr>
+              <w:t>^</w:t>
+            </w:r>
+            <w:r>
+              <w:rPr>
+                <w:rFonts w:ascii="Consolas" w:hAnsi="Consolas"/>
+                <w:color w:val="141820"/>
+                <w:sz w:val="18"/>
+              </w:rPr>
               <w:br/>
               <w:t xml:space="preserve">  "UPDATE drivers SET rating = 4.99 WHERE driver_id = 'DRV-0001';"</w:t>
             </w:r>
@@ -4016,7 +4109,11 @@
               <w:bidi w:val="0"/>
               <w:spacing w:lineRule="auto" w:line="276" w:before="0" w:after="200"/>
               <w:jc w:val="start"/>
-              <w:rPr/>
+              <w:rPr>
+                <w:rFonts w:ascii="Consolas" w:hAnsi="Consolas"/>
+                <w:color w:val="141820"/>
+                <w:sz w:val="18"/>
+              </w:rPr>
             </w:pPr>
             <w:r>
               <w:rPr>
@@ -4102,11 +4199,59 @@
                 <w:color w:val="141820"/>
                 <w:sz w:val="18"/>
               </w:rPr>
-              <w:t>docker exec kafka1 kafka-console-consumer \</w:t>
+              <w:t xml:space="preserve">docker exec kafka1 kafka-console-consumer </w:t>
+            </w:r>
+            <w:r>
+              <w:rPr>
+                <w:rFonts w:ascii="Consolas" w:hAnsi="Consolas"/>
+                <w:color w:val="141820"/>
+                <w:sz w:val="18"/>
+                <w:lang w:val="en-IN"/>
+              </w:rPr>
+              <w:t>^</w:t>
+            </w:r>
+            <w:r>
+              <w:rPr>
+                <w:rFonts w:ascii="Consolas" w:hAnsi="Consolas"/>
+                <w:color w:val="141820"/>
+                <w:sz w:val="18"/>
+              </w:rPr>
               <w:br/>
-              <w:t xml:space="preserve">  --bootstrap-server kafka1:29092 \</w:t>
+              <w:t xml:space="preserve">  --bootstrap-server kafka1:29092 </w:t>
+            </w:r>
+            <w:r>
+              <w:rPr>
+                <w:rFonts w:ascii="Consolas" w:hAnsi="Consolas"/>
+                <w:color w:val="141820"/>
+                <w:sz w:val="18"/>
+                <w:lang w:val="en-IN"/>
+              </w:rPr>
+              <w:t>^</w:t>
+            </w:r>
+            <w:r>
+              <w:rPr>
+                <w:rFonts w:ascii="Consolas" w:hAnsi="Consolas"/>
+                <w:color w:val="141820"/>
+                <w:sz w:val="18"/>
+              </w:rPr>
               <w:br/>
-              <w:t xml:space="preserve">  --topic trips-enriched \</w:t>
+              <w:t xml:space="preserve">  --topic trips-enriched </w:t>
+            </w:r>
+            <w:r>
+              <w:rPr>
+                <w:rFonts w:ascii="Consolas" w:hAnsi="Consolas"/>
+                <w:color w:val="141820"/>
+                <w:sz w:val="18"/>
+                <w:lang w:val="en-IN"/>
+              </w:rPr>
+              <w:t>^</w:t>
+            </w:r>
+            <w:r>
+              <w:rPr>
+                <w:rFonts w:ascii="Consolas" w:hAnsi="Consolas"/>
+                <w:color w:val="141820"/>
+                <w:sz w:val="18"/>
+              </w:rPr>
               <w:br/>
               <w:t xml:space="preserve">  --from-beginning --max-messages 1 | python -m json.tool</w:t>
             </w:r>
@@ -5938,7 +6083,23 @@
                 <w:color w:val="141820"/>
                 <w:sz w:val="18"/>
               </w:rPr>
-              <w:t>docker exec kafka1 kafka-consumer-groups --bootstrap-server kafka1:29092 \</w:t>
+              <w:t xml:space="preserve">docker exec kafka1 kafka-consumer-groups --bootstrap-server kafka1:29092 </w:t>
+            </w:r>
+            <w:r>
+              <w:rPr>
+                <w:rFonts w:ascii="Consolas" w:hAnsi="Consolas"/>
+                <w:color w:val="141820"/>
+                <w:sz w:val="18"/>
+                <w:lang w:val="en-IN"/>
+              </w:rPr>
+              <w:t>^</w:t>
+            </w:r>
+            <w:r>
+              <w:rPr>
+                <w:rFonts w:ascii="Consolas" w:hAnsi="Consolas"/>
+                <w:color w:val="141820"/>
+                <w:sz w:val="18"/>
+              </w:rPr>
               <w:br/>
               <w:t xml:space="preserve">  --describe --group trip-processor-v1</w:t>
             </w:r>
@@ -8698,13 +8859,77 @@
                 <w:color w:val="141820"/>
                 <w:sz w:val="18"/>
               </w:rPr>
-              <w:t>docker exec kafka1 kafka-console-consumer \</w:t>
+              <w:t xml:space="preserve">docker exec kafka1 kafka-console-consumer </w:t>
+            </w:r>
+            <w:r>
+              <w:rPr>
+                <w:rFonts w:ascii="Consolas" w:hAnsi="Consolas"/>
+                <w:color w:val="141820"/>
+                <w:sz w:val="18"/>
+                <w:lang w:val="en-IN"/>
+              </w:rPr>
+              <w:t>^</w:t>
+            </w:r>
+            <w:r>
+              <w:rPr>
+                <w:rFonts w:ascii="Consolas" w:hAnsi="Consolas"/>
+                <w:color w:val="141820"/>
+                <w:sz w:val="18"/>
+              </w:rPr>
               <w:br/>
-              <w:t xml:space="preserve">  --bootstrap-server kafka1:29092 \</w:t>
+              <w:t xml:space="preserve">  --bootstrap-server kafka1:29092 </w:t>
+            </w:r>
+            <w:r>
+              <w:rPr>
+                <w:rFonts w:ascii="Consolas" w:hAnsi="Consolas"/>
+                <w:color w:val="141820"/>
+                <w:sz w:val="18"/>
+                <w:lang w:val="en-IN"/>
+              </w:rPr>
+              <w:t>^</w:t>
+            </w:r>
+            <w:r>
+              <w:rPr>
+                <w:rFonts w:ascii="Consolas" w:hAnsi="Consolas"/>
+                <w:color w:val="141820"/>
+                <w:sz w:val="18"/>
+              </w:rPr>
               <w:br/>
-              <w:t xml:space="preserve">  --topic surge-events \</w:t>
+              <w:t xml:space="preserve">  --topic surge-events </w:t>
+            </w:r>
+            <w:r>
+              <w:rPr>
+                <w:rFonts w:ascii="Consolas" w:hAnsi="Consolas"/>
+                <w:color w:val="141820"/>
+                <w:sz w:val="18"/>
+                <w:lang w:val="en-IN"/>
+              </w:rPr>
+              <w:t>^</w:t>
+            </w:r>
+            <w:r>
+              <w:rPr>
+                <w:rFonts w:ascii="Consolas" w:hAnsi="Consolas"/>
+                <w:color w:val="141820"/>
+                <w:sz w:val="18"/>
+              </w:rPr>
               <w:br/>
-              <w:t xml:space="preserve">  --from-beginning --max-messages 5 \</w:t>
+              <w:t xml:space="preserve">  --from-beginning --max-messages 5 </w:t>
+            </w:r>
+            <w:r>
+              <w:rPr>
+                <w:rFonts w:ascii="Consolas" w:hAnsi="Consolas"/>
+                <w:color w:val="141820"/>
+                <w:sz w:val="18"/>
+                <w:lang w:val="en-IN"/>
+              </w:rPr>
+              <w:t>^</w:t>
+            </w:r>
+            <w:r>
+              <w:rPr>
+                <w:rFonts w:ascii="Consolas" w:hAnsi="Consolas"/>
+                <w:color w:val="141820"/>
+                <w:sz w:val="18"/>
+              </w:rPr>
               <w:br/>
               <w:t xml:space="preserve">  --property print.key=true</w:t>
             </w:r>
@@ -9182,20 +9407,6 @@
         <w:t>What this does:  registers an existing Kafka topic as a ksqlDB STREAM so you can query it with SQL.</w:t>
       </w:r>
     </w:p>
-    <w:p>
-      <w:pPr>
-        <w:pStyle w:val="Normal"/>
-        <w:spacing w:before="0" w:after="40"/>
-        <w:ind w:start="227"/>
-        <w:rPr/>
-      </w:pPr>
-      <w:r>
-        <w:rPr>
-          <w:sz w:val="22"/>
-        </w:rPr>
-        <w:t>4. Inspect what ksqlDB now knows about.</w:t>
-      </w:r>
-    </w:p>
     <w:tbl>
       <w:tblPr>
         <w:tblW w:w="9972" w:type="dxa"/>
@@ -9244,6 +9455,20 @@
         </w:tc>
       </w:tr>
     </w:tbl>
+    <w:p>
+      <w:pPr>
+        <w:pStyle w:val="Normal"/>
+        <w:spacing w:before="0" w:after="40"/>
+        <w:ind w:start="227"/>
+        <w:rPr/>
+      </w:pPr>
+      <w:r>
+        <w:rPr>
+          <w:sz w:val="22"/>
+        </w:rPr>
+        <w:t>4. Inspect what ksqlDB now knows about.</w:t>
+      </w:r>
+    </w:p>
     <w:p>
       <w:pPr>
         <w:pStyle w:val="Normal"/>
@@ -12576,6 +12801,7 @@
         </w:tabs>
         <w:ind w:start="1080" w:hanging="360"/>
       </w:pPr>
+      <w:rPr/>
     </w:lvl>
     <w:lvl w:ilvl="2">
       <w:start w:val="1"/>
@@ -12588,6 +12814,7 @@
         </w:tabs>
         <w:ind w:start="1440" w:hanging="360"/>
       </w:pPr>
+      <w:rPr/>
     </w:lvl>
     <w:lvl w:ilvl="3">
       <w:start w:val="1"/>
@@ -12600,6 +12827,7 @@
         </w:tabs>
         <w:ind w:start="1800" w:hanging="360"/>
       </w:pPr>
+      <w:rPr/>
     </w:lvl>
     <w:lvl w:ilvl="4">
       <w:start w:val="1"/>
@@ -12612,6 +12840,7 @@
         </w:tabs>
         <w:ind w:start="2160" w:hanging="360"/>
       </w:pPr>
+      <w:rPr/>
     </w:lvl>
     <w:lvl w:ilvl="5">
       <w:start w:val="1"/>
@@ -12624,6 +12853,7 @@
         </w:tabs>
         <w:ind w:start="2520" w:hanging="360"/>
       </w:pPr>
+      <w:rPr/>
     </w:lvl>
     <w:lvl w:ilvl="6">
       <w:start w:val="1"/>
@@ -12636,6 +12866,7 @@
         </w:tabs>
         <w:ind w:start="2880" w:hanging="360"/>
       </w:pPr>
+      <w:rPr/>
     </w:lvl>
     <w:lvl w:ilvl="7">
       <w:start w:val="1"/>
@@ -12648,6 +12879,7 @@
         </w:tabs>
         <w:ind w:start="3240" w:hanging="360"/>
       </w:pPr>
+      <w:rPr/>
     </w:lvl>
     <w:lvl w:ilvl="8">
       <w:start w:val="1"/>
@@ -12660,6 +12892,7 @@
         </w:tabs>
         <w:ind w:start="3600" w:hanging="360"/>
       </w:pPr>
+      <w:rPr/>
     </w:lvl>
   </w:abstractNum>
   <w:abstractNum w:abstractNumId="2">
@@ -12689,6 +12922,7 @@
         </w:tabs>
         <w:ind w:start="1080" w:hanging="360"/>
       </w:pPr>
+      <w:rPr/>
     </w:lvl>
     <w:lvl w:ilvl="2">
       <w:start w:val="1"/>
@@ -12701,6 +12935,7 @@
         </w:tabs>
         <w:ind w:start="1440" w:hanging="360"/>
       </w:pPr>
+      <w:rPr/>
     </w:lvl>
     <w:lvl w:ilvl="3">
       <w:start w:val="1"/>
@@ -12713,6 +12948,7 @@
         </w:tabs>
         <w:ind w:start="1800" w:hanging="360"/>
       </w:pPr>
+      <w:rPr/>
     </w:lvl>
     <w:lvl w:ilvl="4">
       <w:start w:val="1"/>
@@ -12725,6 +12961,7 @@
         </w:tabs>
         <w:ind w:start="2160" w:hanging="360"/>
       </w:pPr>
+      <w:rPr/>
     </w:lvl>
     <w:lvl w:ilvl="5">
       <w:start w:val="1"/>
@@ -12737,6 +12974,7 @@
         </w:tabs>
         <w:ind w:start="2520" w:hanging="360"/>
       </w:pPr>
+      <w:rPr/>
     </w:lvl>
     <w:lvl w:ilvl="6">
       <w:start w:val="1"/>
@@ -12749,6 +12987,7 @@
         </w:tabs>
         <w:ind w:start="2880" w:hanging="360"/>
       </w:pPr>
+      <w:rPr/>
     </w:lvl>
     <w:lvl w:ilvl="7">
       <w:start w:val="1"/>
@@ -12761,6 +13000,7 @@
         </w:tabs>
         <w:ind w:start="3240" w:hanging="360"/>
       </w:pPr>
+      <w:rPr/>
     </w:lvl>
     <w:lvl w:ilvl="8">
       <w:start w:val="1"/>
@@ -12773,6 +13013,7 @@
         </w:tabs>
         <w:ind w:start="3600" w:hanging="360"/>
       </w:pPr>
+      <w:rPr/>
     </w:lvl>
   </w:abstractNum>
   <w:abstractNum w:abstractNumId="3">
@@ -12802,6 +13043,7 @@
         </w:tabs>
         <w:ind w:start="1080" w:hanging="360"/>
       </w:pPr>
+      <w:rPr/>
     </w:lvl>
     <w:lvl w:ilvl="2">
       <w:start w:val="1"/>
@@ -12814,6 +13056,7 @@
         </w:tabs>
         <w:ind w:start="1440" w:hanging="360"/>
       </w:pPr>
+      <w:rPr/>
     </w:lvl>
     <w:lvl w:ilvl="3">
       <w:start w:val="1"/>
@@ -12826,6 +13069,7 @@
         </w:tabs>
         <w:ind w:start="1800" w:hanging="360"/>
       </w:pPr>
+      <w:rPr/>
     </w:lvl>
     <w:lvl w:ilvl="4">
       <w:start w:val="1"/>
@@ -12838,6 +13082,7 @@
         </w:tabs>
         <w:ind w:start="2160" w:hanging="360"/>
       </w:pPr>
+      <w:rPr/>
     </w:lvl>
     <w:lvl w:ilvl="5">
       <w:start w:val="1"/>
@@ -12850,6 +13095,7 @@
         </w:tabs>
         <w:ind w:start="2520" w:hanging="360"/>
       </w:pPr>
+      <w:rPr/>
     </w:lvl>
     <w:lvl w:ilvl="6">
       <w:start w:val="1"/>
@@ -12862,6 +13108,7 @@
         </w:tabs>
         <w:ind w:start="2880" w:hanging="360"/>
       </w:pPr>
+      <w:rPr/>
     </w:lvl>
     <w:lvl w:ilvl="7">
       <w:start w:val="1"/>
@@ -12874,6 +13121,7 @@
         </w:tabs>
         <w:ind w:start="3240" w:hanging="360"/>
       </w:pPr>
+      <w:rPr/>
     </w:lvl>
     <w:lvl w:ilvl="8">
       <w:start w:val="1"/>
@@ -12886,6 +13134,7 @@
         </w:tabs>
         <w:ind w:start="3600" w:hanging="360"/>
       </w:pPr>
+      <w:rPr/>
     </w:lvl>
   </w:abstractNum>
   <w:abstractNum w:abstractNumId="4">
@@ -12913,6 +13162,7 @@
         </w:tabs>
         <w:ind w:start="1080" w:hanging="360"/>
       </w:pPr>
+      <w:rPr/>
     </w:lvl>
     <w:lvl w:ilvl="2">
       <w:start w:val="1"/>
@@ -12925,6 +13175,7 @@
         </w:tabs>
         <w:ind w:start="1440" w:hanging="360"/>
       </w:pPr>
+      <w:rPr/>
     </w:lvl>
     <w:lvl w:ilvl="3">
       <w:start w:val="1"/>
@@ -12937,6 +13188,7 @@
         </w:tabs>
         <w:ind w:start="1800" w:hanging="360"/>
       </w:pPr>
+      <w:rPr/>
     </w:lvl>
     <w:lvl w:ilvl="4">
       <w:start w:val="1"/>
@@ -12949,6 +13201,7 @@
         </w:tabs>
         <w:ind w:start="2160" w:hanging="360"/>
       </w:pPr>
+      <w:rPr/>
     </w:lvl>
     <w:lvl w:ilvl="5">
       <w:start w:val="1"/>
@@ -12961,6 +13214,7 @@
         </w:tabs>
         <w:ind w:start="2520" w:hanging="360"/>
       </w:pPr>
+      <w:rPr/>
     </w:lvl>
     <w:lvl w:ilvl="6">
       <w:start w:val="1"/>
@@ -12973,6 +13227,7 @@
         </w:tabs>
         <w:ind w:start="2880" w:hanging="360"/>
       </w:pPr>
+      <w:rPr/>
     </w:lvl>
     <w:lvl w:ilvl="7">
       <w:start w:val="1"/>
@@ -12985,6 +13240,7 @@
         </w:tabs>
         <w:ind w:start="3240" w:hanging="360"/>
       </w:pPr>
+      <w:rPr/>
     </w:lvl>
     <w:lvl w:ilvl="8">
       <w:start w:val="1"/>
@@ -12997,6 +13253,7 @@
         </w:tabs>
         <w:ind w:start="3600" w:hanging="360"/>
       </w:pPr>
+      <w:rPr/>
     </w:lvl>
   </w:abstractNum>
   <w:abstractNum w:abstractNumId="5">
@@ -13024,6 +13281,7 @@
         </w:tabs>
         <w:ind w:start="1080" w:hanging="360"/>
       </w:pPr>
+      <w:rPr/>
     </w:lvl>
     <w:lvl w:ilvl="2">
       <w:start w:val="1"/>
@@ -13036,6 +13294,7 @@
         </w:tabs>
         <w:ind w:start="1440" w:hanging="360"/>
       </w:pPr>
+      <w:rPr/>
     </w:lvl>
     <w:lvl w:ilvl="3">
       <w:start w:val="1"/>
@@ -13048,6 +13307,7 @@
         </w:tabs>
         <w:ind w:start="1800" w:hanging="360"/>
       </w:pPr>
+      <w:rPr/>
     </w:lvl>
     <w:lvl w:ilvl="4">
       <w:start w:val="1"/>
@@ -13060,6 +13320,7 @@
         </w:tabs>
         <w:ind w:start="2160" w:hanging="360"/>
       </w:pPr>
+      <w:rPr/>
     </w:lvl>
     <w:lvl w:ilvl="5">
       <w:start w:val="1"/>
@@ -13072,6 +13333,7 @@
         </w:tabs>
         <w:ind w:start="2520" w:hanging="360"/>
       </w:pPr>
+      <w:rPr/>
     </w:lvl>
     <w:lvl w:ilvl="6">
       <w:start w:val="1"/>
@@ -13084,6 +13346,7 @@
         </w:tabs>
         <w:ind w:start="2880" w:hanging="360"/>
       </w:pPr>
+      <w:rPr/>
     </w:lvl>
     <w:lvl w:ilvl="7">
       <w:start w:val="1"/>
@@ -13096,6 +13359,7 @@
         </w:tabs>
         <w:ind w:start="3240" w:hanging="360"/>
       </w:pPr>
+      <w:rPr/>
     </w:lvl>
     <w:lvl w:ilvl="8">
       <w:start w:val="1"/>
@@ -13108,6 +13372,7 @@
         </w:tabs>
         <w:ind w:start="3600" w:hanging="360"/>
       </w:pPr>
+      <w:rPr/>
     </w:lvl>
   </w:abstractNum>
   <w:abstractNum w:abstractNumId="6">
@@ -13135,6 +13400,7 @@
         </w:tabs>
         <w:ind w:start="1080" w:hanging="360"/>
       </w:pPr>
+      <w:rPr/>
     </w:lvl>
     <w:lvl w:ilvl="2">
       <w:start w:val="1"/>
@@ -13147,6 +13413,7 @@
         </w:tabs>
         <w:ind w:start="1440" w:hanging="360"/>
       </w:pPr>
+      <w:rPr/>
     </w:lvl>
     <w:lvl w:ilvl="3">
       <w:start w:val="1"/>
@@ -13159,6 +13426,7 @@
         </w:tabs>
         <w:ind w:start="1800" w:hanging="360"/>
       </w:pPr>
+      <w:rPr/>
     </w:lvl>
     <w:lvl w:ilvl="4">
       <w:start w:val="1"/>
@@ -13171,6 +13439,7 @@
         </w:tabs>
         <w:ind w:start="2160" w:hanging="360"/>
       </w:pPr>
+      <w:rPr/>
     </w:lvl>
     <w:lvl w:ilvl="5">
       <w:start w:val="1"/>
@@ -13183,6 +13452,7 @@
         </w:tabs>
         <w:ind w:start="2520" w:hanging="360"/>
       </w:pPr>
+      <w:rPr/>
     </w:lvl>
     <w:lvl w:ilvl="6">
       <w:start w:val="1"/>
@@ -13195,6 +13465,7 @@
         </w:tabs>
         <w:ind w:start="2880" w:hanging="360"/>
       </w:pPr>
+      <w:rPr/>
     </w:lvl>
     <w:lvl w:ilvl="7">
       <w:start w:val="1"/>
@@ -13207,6 +13478,7 @@
         </w:tabs>
         <w:ind w:start="3240" w:hanging="360"/>
       </w:pPr>
+      <w:rPr/>
     </w:lvl>
     <w:lvl w:ilvl="8">
       <w:start w:val="1"/>
@@ -13219,6 +13491,7 @@
         </w:tabs>
         <w:ind w:start="3600" w:hanging="360"/>
       </w:pPr>
+      <w:rPr/>
     </w:lvl>
   </w:abstractNum>
   <w:abstractNum w:abstractNumId="7">
@@ -13369,7 +13642,7 @@
   <w:docDefaults>
     <w:rPrDefault>
       <w:rPr>
-        <w:rFonts w:ascii="Cambria" w:hAnsi="Cambria" w:eastAsia="ＭＳ 明朝" w:cs="" w:asciiTheme="minorHAnsi" w:cstheme="minorBidi" w:eastAsiaTheme="minorEastAsia" w:hAnsiTheme="minorHAnsi"/>
+        <w:rFonts w:ascii="Cambria" w:hAnsi="Cambria" w:eastAsia="" w:cs="" w:asciiTheme="minorHAnsi" w:cstheme="minorBidi" w:eastAsiaTheme="minorEastAsia" w:hAnsiTheme="minorHAnsi"/>
         <w:sz w:val="22"/>
         <w:szCs w:val="22"/>
         <w:lang w:val="en-US" w:eastAsia="en-US" w:bidi="ar-SA"/>
@@ -13526,12 +13799,13 @@
     <w:rsid w:val="00fc693f"/>
     <w:pPr>
       <w:widowControl/>
+      <w:suppressAutoHyphens w:val="true"/>
       <w:bidi w:val="0"/>
       <w:spacing w:lineRule="auto" w:line="276" w:before="0" w:after="200"/>
       <w:jc w:val="start"/>
     </w:pPr>
     <w:rPr>
-      <w:rFonts w:ascii="Calibri" w:hAnsi="Calibri" w:eastAsia="ＭＳ 明朝" w:cs="" w:cstheme="minorBidi" w:eastAsiaTheme="minorEastAsia"/>
+      <w:rFonts w:ascii="Calibri" w:hAnsi="Calibri" w:eastAsia="" w:cs="" w:cstheme="minorBidi" w:eastAsiaTheme="minorEastAsia"/>
       <w:color w:val="auto"/>
       <w:kern w:val="0"/>
       <w:sz w:val="22"/>
@@ -13554,7 +13828,7 @@
       <w:outlineLvl w:val="0"/>
     </w:pPr>
     <w:rPr>
-      <w:rFonts w:ascii="Calibri" w:hAnsi="Calibri" w:eastAsia="ＭＳ ゴシック" w:cs="" w:asciiTheme="majorHAnsi" w:cstheme="majorBidi" w:eastAsiaTheme="majorEastAsia" w:hAnsiTheme="majorHAnsi"/>
+      <w:rFonts w:ascii="Calibri" w:hAnsi="Calibri" w:eastAsia="" w:cs="" w:asciiTheme="majorHAnsi" w:cstheme="majorBidi" w:eastAsiaTheme="majorEastAsia" w:hAnsiTheme="majorHAnsi"/>
       <w:b/>
       <w:bCs/>
       <w:color w:themeColor="accent1" w:themeShade="bf" w:val="365F91"/>
@@ -13578,7 +13852,7 @@
       <w:outlineLvl w:val="1"/>
     </w:pPr>
     <w:rPr>
-      <w:rFonts w:ascii="Calibri" w:hAnsi="Calibri" w:eastAsia="ＭＳ ゴシック" w:cs="" w:asciiTheme="majorHAnsi" w:cstheme="majorBidi" w:eastAsiaTheme="majorEastAsia" w:hAnsiTheme="majorHAnsi"/>
+      <w:rFonts w:ascii="Calibri" w:hAnsi="Calibri" w:eastAsia="" w:cs="" w:asciiTheme="majorHAnsi" w:cstheme="majorBidi" w:eastAsiaTheme="majorEastAsia" w:hAnsiTheme="majorHAnsi"/>
       <w:b/>
       <w:bCs/>
       <w:color w:themeColor="accent1" w:val="4F81BD"/>
@@ -13602,7 +13876,7 @@
       <w:outlineLvl w:val="2"/>
     </w:pPr>
     <w:rPr>
-      <w:rFonts w:ascii="Calibri" w:hAnsi="Calibri" w:eastAsia="ＭＳ ゴシック" w:cs="" w:asciiTheme="majorHAnsi" w:cstheme="majorBidi" w:eastAsiaTheme="majorEastAsia" w:hAnsiTheme="majorHAnsi"/>
+      <w:rFonts w:ascii="Calibri" w:hAnsi="Calibri" w:eastAsia="" w:cs="" w:asciiTheme="majorHAnsi" w:cstheme="majorBidi" w:eastAsiaTheme="majorEastAsia" w:hAnsiTheme="majorHAnsi"/>
       <w:b/>
       <w:bCs/>
       <w:color w:themeColor="accent1" w:val="4F81BD"/>
@@ -13625,7 +13899,7 @@
       <w:outlineLvl w:val="3"/>
     </w:pPr>
     <w:rPr>
-      <w:rFonts w:ascii="Calibri" w:hAnsi="Calibri" w:eastAsia="ＭＳ ゴシック" w:cs="" w:asciiTheme="majorHAnsi" w:cstheme="majorBidi" w:eastAsiaTheme="majorEastAsia" w:hAnsiTheme="majorHAnsi"/>
+      <w:rFonts w:ascii="Calibri" w:hAnsi="Calibri" w:eastAsia="" w:cs="" w:asciiTheme="majorHAnsi" w:cstheme="majorBidi" w:eastAsiaTheme="majorEastAsia" w:hAnsiTheme="majorHAnsi"/>
       <w:b/>
       <w:bCs/>
       <w:i/>
@@ -13650,7 +13924,7 @@
       <w:outlineLvl w:val="4"/>
     </w:pPr>
     <w:rPr>
-      <w:rFonts w:ascii="Calibri" w:hAnsi="Calibri" w:eastAsia="ＭＳ ゴシック" w:cs="" w:asciiTheme="majorHAnsi" w:cstheme="majorBidi" w:eastAsiaTheme="majorEastAsia" w:hAnsiTheme="majorHAnsi"/>
+      <w:rFonts w:ascii="Calibri" w:hAnsi="Calibri" w:eastAsia="" w:cs="" w:asciiTheme="majorHAnsi" w:cstheme="majorBidi" w:eastAsiaTheme="majorEastAsia" w:hAnsiTheme="majorHAnsi"/>
       <w:color w:themeColor="accent1" w:themeShade="7f" w:val="243F60"/>
     </w:rPr>
   </w:style>
@@ -13671,7 +13945,7 @@
       <w:outlineLvl w:val="5"/>
     </w:pPr>
     <w:rPr>
-      <w:rFonts w:ascii="Calibri" w:hAnsi="Calibri" w:eastAsia="ＭＳ ゴシック" w:cs="" w:asciiTheme="majorHAnsi" w:cstheme="majorBidi" w:eastAsiaTheme="majorEastAsia" w:hAnsiTheme="majorHAnsi"/>
+      <w:rFonts w:ascii="Calibri" w:hAnsi="Calibri" w:eastAsia="" w:cs="" w:asciiTheme="majorHAnsi" w:cstheme="majorBidi" w:eastAsiaTheme="majorEastAsia" w:hAnsiTheme="majorHAnsi"/>
       <w:i/>
       <w:iCs/>
       <w:color w:themeColor="accent1" w:themeShade="7f" w:val="243F60"/>
@@ -13694,7 +13968,7 @@
       <w:outlineLvl w:val="6"/>
     </w:pPr>
     <w:rPr>
-      <w:rFonts w:ascii="Calibri" w:hAnsi="Calibri" w:eastAsia="ＭＳ ゴシック" w:cs="" w:asciiTheme="majorHAnsi" w:cstheme="majorBidi" w:eastAsiaTheme="majorEastAsia" w:hAnsiTheme="majorHAnsi"/>
+      <w:rFonts w:ascii="Calibri" w:hAnsi="Calibri" w:eastAsia="" w:cs="" w:asciiTheme="majorHAnsi" w:cstheme="majorBidi" w:eastAsiaTheme="majorEastAsia" w:hAnsiTheme="majorHAnsi"/>
       <w:i/>
       <w:iCs/>
       <w:color w:themeColor="text1" w:themeTint="bf" w:val="404040"/>
@@ -13717,7 +13991,7 @@
       <w:outlineLvl w:val="7"/>
     </w:pPr>
     <w:rPr>
-      <w:rFonts w:ascii="Calibri" w:hAnsi="Calibri" w:eastAsia="ＭＳ ゴシック" w:cs="" w:asciiTheme="majorHAnsi" w:cstheme="majorBidi" w:eastAsiaTheme="majorEastAsia" w:hAnsiTheme="majorHAnsi"/>
+      <w:rFonts w:ascii="Calibri" w:hAnsi="Calibri" w:eastAsia="" w:cs="" w:asciiTheme="majorHAnsi" w:cstheme="majorBidi" w:eastAsiaTheme="majorEastAsia" w:hAnsiTheme="majorHAnsi"/>
       <w:color w:themeColor="accent1" w:val="4F81BD"/>
       <w:sz w:val="20"/>
       <w:szCs w:val="20"/>
@@ -13740,7 +14014,7 @@
       <w:outlineLvl w:val="8"/>
     </w:pPr>
     <w:rPr>
-      <w:rFonts w:ascii="Calibri" w:hAnsi="Calibri" w:eastAsia="ＭＳ ゴシック" w:cs="" w:asciiTheme="majorHAnsi" w:cstheme="majorBidi" w:eastAsiaTheme="majorEastAsia" w:hAnsiTheme="majorHAnsi"/>
+      <w:rFonts w:ascii="Calibri" w:hAnsi="Calibri" w:eastAsia="" w:cs="" w:asciiTheme="majorHAnsi" w:cstheme="majorBidi" w:eastAsiaTheme="majorEastAsia" w:hAnsiTheme="majorHAnsi"/>
       <w:i/>
       <w:iCs/>
       <w:color w:themeColor="text1" w:themeTint="bf" w:val="404040"/>
@@ -13782,7 +14056,7 @@
     <w:qFormat/>
     <w:rsid w:val="00fc693f"/>
     <w:rPr>
-      <w:rFonts w:ascii="Calibri" w:hAnsi="Calibri" w:eastAsia="ＭＳ ゴシック" w:cs="" w:asciiTheme="majorHAnsi" w:cstheme="majorBidi" w:eastAsiaTheme="majorEastAsia" w:hAnsiTheme="majorHAnsi"/>
+      <w:rFonts w:ascii="Calibri" w:hAnsi="Calibri" w:eastAsia="" w:cs="" w:asciiTheme="majorHAnsi" w:cstheme="majorBidi" w:eastAsiaTheme="majorEastAsia" w:hAnsiTheme="majorHAnsi"/>
       <w:b/>
       <w:bCs/>
       <w:color w:themeColor="accent1" w:themeShade="bf" w:val="365F91"/>
@@ -13798,7 +14072,7 @@
     <w:qFormat/>
     <w:rsid w:val="00fc693f"/>
     <w:rPr>
-      <w:rFonts w:ascii="Calibri" w:hAnsi="Calibri" w:eastAsia="ＭＳ ゴシック" w:cs="" w:asciiTheme="majorHAnsi" w:cstheme="majorBidi" w:eastAsiaTheme="majorEastAsia" w:hAnsiTheme="majorHAnsi"/>
+      <w:rFonts w:ascii="Calibri" w:hAnsi="Calibri" w:eastAsia="" w:cs="" w:asciiTheme="majorHAnsi" w:cstheme="majorBidi" w:eastAsiaTheme="majorEastAsia" w:hAnsiTheme="majorHAnsi"/>
       <w:b/>
       <w:bCs/>
       <w:color w:themeColor="accent1" w:val="4F81BD"/>
@@ -13814,7 +14088,7 @@
     <w:qFormat/>
     <w:rsid w:val="00fc693f"/>
     <w:rPr>
-      <w:rFonts w:ascii="Calibri" w:hAnsi="Calibri" w:eastAsia="ＭＳ ゴシック" w:cs="" w:asciiTheme="majorHAnsi" w:cstheme="majorBidi" w:eastAsiaTheme="majorEastAsia" w:hAnsiTheme="majorHAnsi"/>
+      <w:rFonts w:ascii="Calibri" w:hAnsi="Calibri" w:eastAsia="" w:cs="" w:asciiTheme="majorHAnsi" w:cstheme="majorBidi" w:eastAsiaTheme="majorEastAsia" w:hAnsiTheme="majorHAnsi"/>
       <w:b/>
       <w:bCs/>
       <w:color w:themeColor="accent1" w:val="4F81BD"/>
@@ -13828,7 +14102,7 @@
     <w:qFormat/>
     <w:rsid w:val="00fc693f"/>
     <w:rPr>
-      <w:rFonts w:ascii="Calibri" w:hAnsi="Calibri" w:eastAsia="ＭＳ ゴシック" w:cs="" w:asciiTheme="majorHAnsi" w:cstheme="majorBidi" w:eastAsiaTheme="majorEastAsia" w:hAnsiTheme="majorHAnsi"/>
+      <w:rFonts w:ascii="Calibri" w:hAnsi="Calibri" w:eastAsia="" w:cs="" w:asciiTheme="majorHAnsi" w:cstheme="majorBidi" w:eastAsiaTheme="majorEastAsia" w:hAnsiTheme="majorHAnsi"/>
       <w:color w:themeColor="text2" w:themeShade="bf" w:val="17365D"/>
       <w:spacing w:val="5"/>
       <w:kern w:val="2"/>
@@ -13844,7 +14118,7 @@
     <w:qFormat/>
     <w:rsid w:val="00fc693f"/>
     <w:rPr>
-      <w:rFonts w:ascii="Calibri" w:hAnsi="Calibri" w:eastAsia="ＭＳ ゴシック" w:cs="" w:asciiTheme="majorHAnsi" w:cstheme="majorBidi" w:eastAsiaTheme="majorEastAsia" w:hAnsiTheme="majorHAnsi"/>
+      <w:rFonts w:ascii="Calibri" w:hAnsi="Calibri" w:eastAsia="" w:cs="" w:asciiTheme="majorHAnsi" w:cstheme="majorBidi" w:eastAsiaTheme="majorEastAsia" w:hAnsiTheme="majorHAnsi"/>
       <w:i/>
       <w:iCs/>
       <w:color w:themeColor="accent1" w:val="4F81BD"/>
@@ -13917,7 +14191,7 @@
     <w:qFormat/>
     <w:rsid w:val="00fc693f"/>
     <w:rPr>
-      <w:rFonts w:ascii="Calibri" w:hAnsi="Calibri" w:eastAsia="ＭＳ ゴシック" w:cs="" w:asciiTheme="majorHAnsi" w:cstheme="majorBidi" w:eastAsiaTheme="majorEastAsia" w:hAnsiTheme="majorHAnsi"/>
+      <w:rFonts w:ascii="Calibri" w:hAnsi="Calibri" w:eastAsia="" w:cs="" w:asciiTheme="majorHAnsi" w:cstheme="majorBidi" w:eastAsiaTheme="majorEastAsia" w:hAnsiTheme="majorHAnsi"/>
       <w:b/>
       <w:bCs/>
       <w:i/>
@@ -13934,7 +14208,7 @@
     <w:qFormat/>
     <w:rsid w:val="00fc693f"/>
     <w:rPr>
-      <w:rFonts w:ascii="Calibri" w:hAnsi="Calibri" w:eastAsia="ＭＳ ゴシック" w:cs="" w:asciiTheme="majorHAnsi" w:cstheme="majorBidi" w:eastAsiaTheme="majorEastAsia" w:hAnsiTheme="majorHAnsi"/>
+      <w:rFonts w:ascii="Calibri" w:hAnsi="Calibri" w:eastAsia="" w:cs="" w:asciiTheme="majorHAnsi" w:cstheme="majorBidi" w:eastAsiaTheme="majorEastAsia" w:hAnsiTheme="majorHAnsi"/>
       <w:color w:themeColor="accent1" w:themeShade="7f" w:val="243F60"/>
     </w:rPr>
   </w:style>
@@ -13947,7 +14221,7 @@
     <w:qFormat/>
     <w:rsid w:val="00fc693f"/>
     <w:rPr>
-      <w:rFonts w:ascii="Calibri" w:hAnsi="Calibri" w:eastAsia="ＭＳ ゴシック" w:cs="" w:asciiTheme="majorHAnsi" w:cstheme="majorBidi" w:eastAsiaTheme="majorEastAsia" w:hAnsiTheme="majorHAnsi"/>
+      <w:rFonts w:ascii="Calibri" w:hAnsi="Calibri" w:eastAsia="" w:cs="" w:asciiTheme="majorHAnsi" w:cstheme="majorBidi" w:eastAsiaTheme="majorEastAsia" w:hAnsiTheme="majorHAnsi"/>
       <w:i/>
       <w:iCs/>
       <w:color w:themeColor="accent1" w:themeShade="7f" w:val="243F60"/>
@@ -13962,7 +14236,7 @@
     <w:qFormat/>
     <w:rsid w:val="00fc693f"/>
     <w:rPr>
-      <w:rFonts w:ascii="Calibri" w:hAnsi="Calibri" w:eastAsia="ＭＳ ゴシック" w:cs="" w:asciiTheme="majorHAnsi" w:cstheme="majorBidi" w:eastAsiaTheme="majorEastAsia" w:hAnsiTheme="majorHAnsi"/>
+      <w:rFonts w:ascii="Calibri" w:hAnsi="Calibri" w:eastAsia="" w:cs="" w:asciiTheme="majorHAnsi" w:cstheme="majorBidi" w:eastAsiaTheme="majorEastAsia" w:hAnsiTheme="majorHAnsi"/>
       <w:i/>
       <w:iCs/>
       <w:color w:themeColor="text1" w:themeTint="bf" w:val="404040"/>
@@ -13977,7 +14251,7 @@
     <w:qFormat/>
     <w:rsid w:val="00fc693f"/>
     <w:rPr>
-      <w:rFonts w:ascii="Calibri" w:hAnsi="Calibri" w:eastAsia="ＭＳ ゴシック" w:cs="" w:asciiTheme="majorHAnsi" w:cstheme="majorBidi" w:eastAsiaTheme="majorEastAsia" w:hAnsiTheme="majorHAnsi"/>
+      <w:rFonts w:ascii="Calibri" w:hAnsi="Calibri" w:eastAsia="" w:cs="" w:asciiTheme="majorHAnsi" w:cstheme="majorBidi" w:eastAsiaTheme="majorEastAsia" w:hAnsiTheme="majorHAnsi"/>
       <w:color w:themeColor="accent1" w:val="4F81BD"/>
       <w:sz w:val="20"/>
       <w:szCs w:val="20"/>
@@ -13992,7 +14266,7 @@
     <w:qFormat/>
     <w:rsid w:val="00fc693f"/>
     <w:rPr>
-      <w:rFonts w:ascii="Calibri" w:hAnsi="Calibri" w:eastAsia="ＭＳ ゴシック" w:cs="" w:asciiTheme="majorHAnsi" w:cstheme="majorBidi" w:eastAsiaTheme="majorEastAsia" w:hAnsiTheme="majorHAnsi"/>
+      <w:rFonts w:ascii="Calibri" w:hAnsi="Calibri" w:eastAsia="" w:cs="" w:asciiTheme="majorHAnsi" w:cstheme="majorBidi" w:eastAsiaTheme="majorEastAsia" w:hAnsiTheme="majorHAnsi"/>
       <w:i/>
       <w:iCs/>
       <w:color w:themeColor="text1" w:themeTint="bf" w:val="404040"/>
@@ -14222,12 +14496,13 @@
     <w:rsid w:val="00fc693f"/>
     <w:pPr>
       <w:widowControl/>
+      <w:suppressAutoHyphens w:val="true"/>
       <w:bidi w:val="0"/>
       <w:spacing w:lineRule="auto" w:line="240" w:before="0" w:after="0"/>
       <w:jc w:val="start"/>
     </w:pPr>
     <w:rPr>
-      <w:rFonts w:ascii="Cambria" w:hAnsi="Cambria" w:eastAsia="ＭＳ 明朝" w:cs="" w:asciiTheme="minorHAnsi" w:cstheme="minorBidi" w:eastAsiaTheme="minorEastAsia" w:hAnsiTheme="minorHAnsi"/>
+      <w:rFonts w:ascii="Cambria" w:hAnsi="Cambria" w:eastAsia="" w:cs="" w:asciiTheme="minorHAnsi" w:cstheme="minorBidi" w:eastAsiaTheme="minorEastAsia" w:hAnsiTheme="minorHAnsi"/>
       <w:color w:val="auto"/>
       <w:kern w:val="0"/>
       <w:sz w:val="22"/>
@@ -14251,7 +14526,7 @@
       <w:contextualSpacing/>
     </w:pPr>
     <w:rPr>
-      <w:rFonts w:ascii="Calibri" w:hAnsi="Calibri" w:eastAsia="ＭＳ ゴシック" w:cs="" w:asciiTheme="majorHAnsi" w:cstheme="majorBidi" w:eastAsiaTheme="majorEastAsia" w:hAnsiTheme="majorHAnsi"/>
+      <w:rFonts w:ascii="Calibri" w:hAnsi="Calibri" w:eastAsia="" w:cs="" w:asciiTheme="majorHAnsi" w:cstheme="majorBidi" w:eastAsiaTheme="majorEastAsia" w:hAnsiTheme="majorHAnsi"/>
       <w:color w:themeColor="text2" w:themeShade="bf" w:val="17365D"/>
       <w:spacing w:val="5"/>
       <w:kern w:val="2"/>
@@ -14269,7 +14544,7 @@
     <w:rsid w:val="00fc693f"/>
     <w:pPr/>
     <w:rPr>
-      <w:rFonts w:ascii="Calibri" w:hAnsi="Calibri" w:eastAsia="ＭＳ ゴシック" w:cs="" w:asciiTheme="majorHAnsi" w:cstheme="majorBidi" w:eastAsiaTheme="majorEastAsia" w:hAnsiTheme="majorHAnsi"/>
+      <w:rFonts w:ascii="Calibri" w:hAnsi="Calibri" w:eastAsia="" w:cs="" w:asciiTheme="majorHAnsi" w:cstheme="majorBidi" w:eastAsiaTheme="majorEastAsia" w:hAnsiTheme="majorHAnsi"/>
       <w:i/>
       <w:iCs/>
       <w:color w:themeColor="accent1" w:val="4F81BD"/>
@@ -14502,12 +14777,13 @@
         <w:tab w:val="left" w:pos="3456" w:leader="none"/>
         <w:tab w:val="left" w:pos="4032" w:leader="none"/>
       </w:tabs>
+      <w:suppressAutoHyphens w:val="true"/>
       <w:bidi w:val="0"/>
       <w:spacing w:lineRule="auto" w:line="276" w:before="0" w:after="200"/>
       <w:jc w:val="start"/>
     </w:pPr>
     <w:rPr>
-      <w:rFonts w:ascii="Courier" w:hAnsi="Courier" w:eastAsia="ＭＳ 明朝" w:cs="" w:cstheme="minorBidi" w:eastAsiaTheme="minorEastAsia"/>
+      <w:rFonts w:ascii="Courier" w:hAnsi="Courier" w:eastAsia="" w:cs="" w:cstheme="minorBidi" w:eastAsiaTheme="minorEastAsia"/>
       <w:color w:val="auto"/>
       <w:kern w:val="0"/>
       <w:sz w:val="20"/>
@@ -14572,6 +14848,29 @@
       <w:outlineLvl w:val="9"/>
     </w:pPr>
     <w:rPr/>
+  </w:style>
+  <w:style w:type="paragraph" w:styleId="TableContents">
+    <w:name w:val="Table Contents"/>
+    <w:basedOn w:val="Normal"/>
+    <w:qFormat/>
+    <w:pPr>
+      <w:widowControl w:val="false"/>
+      <w:suppressLineNumbers/>
+    </w:pPr>
+    <w:rPr/>
+  </w:style>
+  <w:style w:type="paragraph" w:styleId="TableHeading">
+    <w:name w:val="Table Heading"/>
+    <w:basedOn w:val="TableContents"/>
+    <w:qFormat/>
+    <w:pPr>
+      <w:suppressLineNumbers/>
+      <w:jc w:val="center"/>
+    </w:pPr>
+    <w:rPr>
+      <w:b/>
+      <w:bCs/>
+    </w:rPr>
   </w:style>
   <w:style w:type="numbering" w:styleId="NoList" w:default="1">
     <w:name w:val="No List"/>
@@ -17705,7 +18004,6 @@
       <w:pPr>
         <w:spacing w:before="0" w:after="0" w:line="240" w:lineRule="auto"/>
       </w:pPr>
-      <w:rPr/>
       <w:tblPr/>
       <w:tcPr>
         <w:tcBorders>
@@ -17851,7 +18149,6 @@
       <w:pPr>
         <w:spacing w:before="0" w:after="0" w:line="240" w:lineRule="auto"/>
       </w:pPr>
-      <w:rPr/>
       <w:tblPr/>
       <w:tcPr>
         <w:tcBorders>
@@ -17997,7 +18294,6 @@
       <w:pPr>
         <w:spacing w:before="0" w:after="0" w:line="240" w:lineRule="auto"/>
       </w:pPr>
-      <w:rPr/>
       <w:tblPr/>
       <w:tcPr>
         <w:tcBorders>
@@ -18143,7 +18439,6 @@
       <w:pPr>
         <w:spacing w:before="0" w:after="0" w:line="240" w:lineRule="auto"/>
       </w:pPr>
-      <w:rPr/>
       <w:tblPr/>
       <w:tcPr>
         <w:tcBorders>
@@ -18289,7 +18584,6 @@
       <w:pPr>
         <w:spacing w:before="0" w:after="0" w:line="240" w:lineRule="auto"/>
       </w:pPr>
-      <w:rPr/>
       <w:tblPr/>
       <w:tcPr>
         <w:tcBorders>
@@ -18435,7 +18729,6 @@
       <w:pPr>
         <w:spacing w:before="0" w:after="0" w:line="240" w:lineRule="auto"/>
       </w:pPr>
-      <w:rPr/>
       <w:tblPr/>
       <w:tcPr>
         <w:tcBorders>
@@ -18581,7 +18874,6 @@
       <w:pPr>
         <w:spacing w:before="0" w:after="0" w:line="240" w:lineRule="auto"/>
       </w:pPr>
-      <w:rPr/>
       <w:tblPr/>
       <w:tcPr>
         <w:tcBorders>

</xml_diff>